<commit_message>
Renumber the reworked EB cases so they stop overwriting the original's spec
input/EB-tests.docx is now in the repository and owns TC-EB-001, which the
rework was also using. Generating from one document then the other silently
replaced generated/TC-EB-001.spec.js, and whichever ran last won - the exact
class of quiet overwrite this project exists to avoid.

The rework is now TC-TNEB-001..003. The hand-written document keeps TC-EB-001
and stays as it is: it is worth keeping unchanged, because the three rules in
scripts/build-tneb-inputs.js are easier to see with the before and after side
by side.

Co-Authored-By: Claude Opus 5 <noreply@anthropic.com>
Claude-Session: https://claude.ai/code/session_01FtkxF2HWgKorSaS1yzUxWk
</commit_message>
<xml_diff>
--- a/input/tneb-tests.docx
+++ b/input/tneb-tests.docx
@@ -18,7 +18,7 @@
           <w:b/>
           <w:bCs/>
         </w:rPr>
-        <w:t xml:space="preserve">Test Case ID: TC-EB-001</w:t>
+        <w:t xml:space="preserve">Test Case ID: TC-TNEB-001</w:t>
       </w:r>
     </w:p>
     <w:p>
@@ -133,7 +133,7 @@
           <w:b/>
           <w:bCs/>
         </w:rPr>
-        <w:t xml:space="preserve">Test Case ID: TC-EB-002</w:t>
+        <w:t xml:space="preserve">Test Case ID: TC-TNEB-002</w:t>
       </w:r>
     </w:p>
     <w:p>
@@ -218,7 +218,7 @@
           <w:b/>
           <w:bCs/>
         </w:rPr>
-        <w:t xml:space="preserve">Test Case ID: TC-EB-003</w:t>
+        <w:t xml:space="preserve">Test Case ID: TC-TNEB-003</w:t>
       </w:r>
     </w:p>
     <w:p>

</xml_diff>